<commit_message>
Sync SnowLotus-CellFM editor v0.3 epoch6 release
</commit_message>
<xml_diff>
--- a/EDITOR_HANDOFF.docx
+++ b/EDITOR_HANDOFF.docx
@@ -151,7 +151,7 @@
         <w:t xml:space="preserve">outputs/foundation_5090_mlm_public_expansion_continuation_v0_3_seed47_b8_vocabwarm/best.pt</w:t>
       </w:r>
       <w:r>
-        <w:t xml:space="preserve">; current best v0.3 epoch-5 eval loss 7.2156, SHA256</w:t>
+        <w:t xml:space="preserve">; current best v0.3 epoch-6 eval loss 7.2026, SHA256</w:t>
       </w:r>
       <w:r>
         <w:t xml:space="preserve"> </w:t>
@@ -160,7 +160,7 @@
         <w:rPr>
           <w:rStyle w:val="VerbatimChar"/>
         </w:rPr>
-        <w:t xml:space="preserve">649448b2071816856cd5f92a43985c6d865d115d45d91274db94cb5f9348d577</w:t>
+        <w:t xml:space="preserve">ed90abffeb110fca3e5a4eb11fefc18cd0198b09669341002971b89eb664bf4c</w:t>
       </w:r>
       <w:r>
         <w:t xml:space="preserve">.</w:t>

</xml_diff>

<commit_message>
Sync SnowLotus-CellFM editor-v0.3 epoch7 source release
</commit_message>
<xml_diff>
--- a/EDITOR_HANDOFF.docx
+++ b/EDITOR_HANDOFF.docx
@@ -151,7 +151,7 @@
         <w:t xml:space="preserve">outputs/foundation_5090_mlm_public_expansion_continuation_v0_3_seed47_b8_vocabwarm/best.pt</w:t>
       </w:r>
       <w:r>
-        <w:t xml:space="preserve">; current best v0.3 epoch-6 eval loss 7.2026, SHA256</w:t>
+        <w:t xml:space="preserve">; current best v0.3 epoch-7 eval loss 7.1917, SHA256</w:t>
       </w:r>
       <w:r>
         <w:t xml:space="preserve"> </w:t>
@@ -160,7 +160,7 @@
         <w:rPr>
           <w:rStyle w:val="VerbatimChar"/>
         </w:rPr>
-        <w:t xml:space="preserve">ed90abffeb110fca3e5a4eb11fefc18cd0198b09669341002971b89eb664bf4c</w:t>
+        <w:t xml:space="preserve">00c1b0a1049c441585ecd7ee03e81d05704bd93100c692cc06f7bdc90f2c034a</w:t>
       </w:r>
       <w:r>
         <w:t xml:space="preserve">.</w:t>
@@ -235,7 +235,7 @@
         <w:pStyle w:val="FirstParagraph"/>
       </w:pPr>
       <w:r>
-        <w:t xml:space="preserve">The GitHub-ready repository is staged at</w:t>
+        <w:t xml:space="preserve">The repository has been published to GitHub at</w:t>
       </w:r>
       <w:r>
         <w:t xml:space="preserve"> </w:t>
@@ -244,40 +244,13 @@
         <w:rPr>
           <w:rStyle w:val="VerbatimChar"/>
         </w:rPr>
-        <w:t xml:space="preserve">/root/snowlotus-cellfm/outputs/github_release/SnowLotus-CellFM</w:t>
+        <w:t xml:space="preserve">https://github.com/ahvsjags/SnowLotus-CellFM</w:t>
       </w:r>
       <w:r>
         <w:t xml:space="preserve"> </w:t>
       </w:r>
       <w:r>
-        <w:t xml:space="preserve">on the RTX 5090 server. The two frozen model files are present in</w:t>
-      </w:r>
-      <w:r>
-        <w:t xml:space="preserve"> </w:t>
-      </w:r>
-      <w:r>
-        <w:rPr>
-          <w:rStyle w:val="VerbatimChar"/>
-        </w:rPr>
-        <w:t xml:space="preserve">models/</w:t>
-      </w:r>
-      <w:r>
-        <w:t xml:space="preserve"> </w:t>
-      </w:r>
-      <w:r>
-        <w:t xml:space="preserve">and verified against</w:t>
-      </w:r>
-      <w:r>
-        <w:t xml:space="preserve"> </w:t>
-      </w:r>
-      <w:r>
-        <w:rPr>
-          <w:rStyle w:val="VerbatimChar"/>
-        </w:rPr>
-        <w:t xml:space="preserve">models/SHA256SUMS.txt</w:t>
-      </w:r>
-      <w:r>
-        <w:t xml:space="preserve">. The completed v0.2 run remains the stable baseline;</w:t>
+        <w:t xml:space="preserve">with release tag</w:t>
       </w:r>
       <w:r>
         <w:t xml:space="preserve"> </w:t>
@@ -289,52 +262,7 @@
         <w:t xml:space="preserve">editor-v0.3</w:t>
       </w:r>
       <w:r>
-        <w:t xml:space="preserve"> </w:t>
-      </w:r>
-      <w:r>
-        <w:t xml:space="preserve">promotes the stronger v0.3 best checkpoint for the submission package while training continues. GitHub publication is blocked only by repository/key authorization: GitHub currently rejects the server deploy key with</w:t>
-      </w:r>
-      <w:r>
-        <w:t xml:space="preserve"> </w:t>
-      </w:r>
-      <w:r>
-        <w:rPr>
-          <w:rStyle w:val="VerbatimChar"/>
-        </w:rPr>
-        <w:t xml:space="preserve">Permission denied (publickey)</w:t>
-      </w:r>
-      <w:r>
-        <w:t xml:space="preserve">. Once the repository</w:t>
-      </w:r>
-      <w:r>
-        <w:t xml:space="preserve"> </w:t>
-      </w:r>
-      <w:r>
-        <w:rPr>
-          <w:rStyle w:val="VerbatimChar"/>
-        </w:rPr>
-        <w:t xml:space="preserve">ahvsjags/SnowLotus-CellFM</w:t>
-      </w:r>
-      <w:r>
-        <w:t xml:space="preserve"> </w:t>
-      </w:r>
-      <w:r>
-        <w:t xml:space="preserve">exists and the deploy key in</w:t>
-      </w:r>
-      <w:r>
-        <w:t xml:space="preserve"> </w:t>
-      </w:r>
-      <w:r>
-        <w:rPr>
-          <w:rStyle w:val="VerbatimChar"/>
-        </w:rPr>
-        <w:t xml:space="preserve">GITHUB_PUSH_INSTRUCTIONS.md</w:t>
-      </w:r>
-      <w:r>
-        <w:t xml:space="preserve"> </w:t>
-      </w:r>
-      <w:r>
-        <w:t xml:space="preserve">has write access, the staged repository can be pushed as-is.</w:t>
+        <w:t xml:space="preserve">. The release contains the source/metadata archive, manuscript archive, one-click editor package and the full model archive with the current best epoch-6 embedding checkpoint. The repository is currently private, so editor/reviewer access should be granted, or the repository should be made public, before using the URL as a reviewer-facing link.</w:t>
       </w:r>
     </w:p>
     <w:p>

</xml_diff>